<commit_message>
Update ECOGRID commercial decks, presentation, and prospect data
Co-Authored-By: Claude Opus 4.8 (1M context) <noreply@anthropic.com>
</commit_message>
<xml_diff>
--- a/SmartGrid/Commercial/ECOGRID_RESORT_2pager_EN.docx
+++ b/SmartGrid/Commercial/ECOGRID_RESORT_2pager_EN.docx
@@ -45,7 +45,7 @@
           <w:sz w:val="18"/>
           <w:szCs w:val="18"/>
         </w:rPr>
-        <w:t xml:space="preserve">Solar generation · battery storage · AI control · guest app — built for open-air tourism</w:t>
+        <w:t>Solar · wind · batteries · V2G EV charging · AI control · guest app — built for open-air tourism</w:t>
       </w:r>
     </w:p>
     <w:p>
@@ -96,74 +96,66 @@
           <w:bCs/>
           <w:color w:val="0B2C3D"/>
         </w:rPr>
-        <w:t xml:space="preserve">Generate : </w:t>
-      </w:r>
-      <w:r>
-        <w:t xml:space="preserve">on-site solar (carports, roofs, pergolas) — turning inert surfaces into productive assets</w:t>
-      </w:r>
-    </w:p>
-    <w:p>
-      <w:pPr>
-        <w:pStyle w:val="ListParagraph"/>
-        <w:numPr>
-          <w:ilvl w:val="0"/>
-          <w:numId w:val="2"/>
-        </w:numPr>
-        <w:spacing w:after="18"/>
-      </w:pPr>
-      <w:r>
-        <w:rPr>
-          <w:b/>
-          <w:bCs/>
-          <w:color w:val="0B2C3D"/>
-        </w:rPr>
-        <w:t xml:space="preserve">Store &amp; control : </w:t>
-      </w:r>
-      <w:r>
-        <w:t xml:space="preserve">LFP batteries for resilience + arbitrage, AI-driven EMS running 24/7</w:t>
-      </w:r>
-    </w:p>
-    <w:p>
-      <w:pPr>
-        <w:pStyle w:val="ListParagraph"/>
-        <w:numPr>
-          <w:ilvl w:val="0"/>
-          <w:numId w:val="2"/>
-        </w:numPr>
-        <w:spacing w:after="18"/>
-      </w:pPr>
-      <w:r>
-        <w:rPr>
-          <w:b/>
-          <w:bCs/>
-          <w:color w:val="0B2C3D"/>
-        </w:rPr>
-        <w:t xml:space="preserve">Distribute &amp; charge : </w:t>
-      </w:r>
-      <w:r>
-        <w:t xml:space="preserve">control of pools, A/C, hot water; EV chargers with smart charging</w:t>
-      </w:r>
-    </w:p>
-    <w:p>
-      <w:pPr>
-        <w:pStyle w:val="ListParagraph"/>
-        <w:numPr>
-          <w:ilvl w:val="0"/>
-          <w:numId w:val="2"/>
-        </w:numPr>
-        <w:spacing w:after="18"/>
-      </w:pPr>
-      <w:r>
-        <w:rPr>
-          <w:b/>
-          <w:bCs/>
-          <w:color w:val="0B2C3D"/>
-        </w:rPr>
-        <w:t xml:space="preserve">Engage &amp; measure : </w:t>
-      </w:r>
-      <w:r>
-        <w:t xml:space="preserve">guest app (EcoScore, EV booking, rewards) and ESG carbon reporting</w:t>
-      </w:r>
+        <w:t>Generate : on-site solar (carports, roofs, pergolas) + wind turbine (optional complement) — turning inert surfaces into productive assets</w:t>
+      </w:r>
+      <w:r/>
+    </w:p>
+    <w:p>
+      <w:pPr>
+        <w:pStyle w:val="ListParagraph"/>
+        <w:numPr>
+          <w:ilvl w:val="0"/>
+          <w:numId w:val="2"/>
+        </w:numPr>
+        <w:spacing w:after="18"/>
+      </w:pPr>
+      <w:r>
+        <w:rPr>
+          <w:b/>
+          <w:bCs/>
+          <w:color w:val="0B2C3D"/>
+        </w:rPr>
+        <w:t>Store &amp; dispatch : LFP batteries (V2G-ready) for resilience, arbitrage &amp; local network feed — AI-driven EMS running 24/7 across all sources including wind &amp; V2G</w:t>
+      </w:r>
+      <w:r/>
+    </w:p>
+    <w:p>
+      <w:pPr>
+        <w:pStyle w:val="ListParagraph"/>
+        <w:numPr>
+          <w:ilvl w:val="0"/>
+          <w:numId w:val="2"/>
+        </w:numPr>
+        <w:spacing w:after="18"/>
+      </w:pPr>
+      <w:r>
+        <w:rPr>
+          <w:b/>
+          <w:bCs/>
+          <w:color w:val="0B2C3D"/>
+        </w:rPr>
+        <w:t>Distribute &amp; charge : control of pools, A/C, hot water; 30–50 EV charge points with smart charging + V2G feedback to the local network</w:t>
+      </w:r>
+      <w:r/>
+    </w:p>
+    <w:p>
+      <w:pPr>
+        <w:pStyle w:val="ListParagraph"/>
+        <w:numPr>
+          <w:ilvl w:val="0"/>
+          <w:numId w:val="2"/>
+        </w:numPr>
+        <w:spacing w:after="18"/>
+      </w:pPr>
+      <w:r>
+        <w:rPr>
+          <w:b/>
+          <w:bCs/>
+          <w:color w:val="0B2C3D"/>
+        </w:rPr>
+        <w:t>Engage &amp; measure : guest app (EcoScore, real-time savings &amp; CO₂ tracker per stay, EV booking, V2G rewards, personalised checkout report) and ESG carbon reporting for the operator</w:t>
+      </w:r>
+      <w:r/>
     </w:p>
     <w:p>
       <w:pPr>

</xml_diff>